<commit_message>
feat(product-detail): Preview Sku row so the preview shows the detail
The preview panel opens celulares/index without ?sku=, so it redirected to the catalogue
and both previews looked the same. On preview hosts (localhost, *.aem.page) a page without
sku now shows the Preview Sku phone; on the live site it still goes back to /celulares.
celulares/index.docx gets the row; README updated.

Co-Authored-By: Claude Opus 5.5 (1M context) <noreply@anthropic.com>
</commit_message>
<xml_diff>
--- a/content-drive/celulares/index.docx
+++ b/content-drive/celulares/index.docx
@@ -243,6 +243,29 @@
                 <w:t xml:space="preserve">https://cca7ebd1-f76f-47d0-a949-b4b8618f05e5.mock.pstmn.io/api/v1/products/detail</w:t>
               </w:r>
             </w:hyperlink>
+          </w:p>
+        </w:tc>
+      </w:tr>
+      <w:tr>
+        <w:tc>
+          <w:tcPr>
+            <w:tcW w:w="2160" w:type="dxa"/>
+          </w:tcPr>
+          <w:p>
+            <w:r>
+              <w:t xml:space="preserve">Preview Sku</w:t>
+            </w:r>
+          </w:p>
+        </w:tc>
+        <w:tc>
+          <w:tcPr>
+            <w:tcW w:w="7200" w:type="dxa"/>
+            <w:gridSpan w:val="2"/>
+          </w:tcPr>
+          <w:p>
+            <w:r>
+              <w:t xml:space="preserve">iph-15-128-blk</w:t>
+            </w:r>
           </w:p>
         </w:tc>
       </w:tr>

</xml_diff>

<commit_message>
feat(product-detail): no sku → back to /celulares; unknown sku → empty list message only
- without ?sku= the page always goes back to the list of phones (/celulares); the Preview Sku
  row is no longer used
- sku validated in the block (SKU_PATTERN: letters, numbers, hyphens); an invalid sku is not
  sent to the service
- not found (404, no data), invalid sku or service error → only the empty list message
  ("Este celular no existe"), no alert; showToast and the alert rows are removed
- celulares/index.docx without Preview Sku / alert rows; README updated

Co-Authored-By: Claude Opus 5.5 (1M context) <noreply@anthropic.com>
</commit_message>
<xml_diff>
--- a/content-drive/celulares/index.docx
+++ b/content-drive/celulares/index.docx
@@ -253,29 +253,6 @@
           </w:tcPr>
           <w:p>
             <w:r>
-              <w:t xml:space="preserve">Preview Sku</w:t>
-            </w:r>
-          </w:p>
-        </w:tc>
-        <w:tc>
-          <w:tcPr>
-            <w:tcW w:w="7200" w:type="dxa"/>
-            <w:gridSpan w:val="2"/>
-          </w:tcPr>
-          <w:p>
-            <w:r>
-              <w:t xml:space="preserve">iph-15-128-blk</w:t>
-            </w:r>
-          </w:p>
-        </w:tc>
-      </w:tr>
-      <w:tr>
-        <w:tc>
-          <w:tcPr>
-            <w:tcW w:w="2160" w:type="dxa"/>
-          </w:tcPr>
-          <w:p>
-            <w:r>
               <w:t xml:space="preserve">Back Text</w:t>
             </w:r>
           </w:p>
@@ -648,75 +625,6 @@
           </w:tcPr>
           <w:p>
             <w:r>
-              <w:t xml:space="preserve">Alert Duration</w:t>
-            </w:r>
-          </w:p>
-        </w:tc>
-        <w:tc>
-          <w:tcPr>
-            <w:tcW w:w="7200" w:type="dxa"/>
-            <w:gridSpan w:val="2"/>
-          </w:tcPr>
-          <w:p>
-            <w:r>
-              <w:t xml:space="preserve">5</w:t>
-            </w:r>
-          </w:p>
-        </w:tc>
-      </w:tr>
-      <w:tr>
-        <w:tc>
-          <w:tcPr>
-            <w:tcW w:w="2160" w:type="dxa"/>
-          </w:tcPr>
-          <w:p>
-            <w:r>
-              <w:t xml:space="preserve">Alert Color</w:t>
-            </w:r>
-          </w:p>
-        </w:tc>
-        <w:tc>
-          <w:tcPr>
-            <w:tcW w:w="7200" w:type="dxa"/>
-            <w:gridSpan w:val="2"/>
-          </w:tcPr>
-          <w:p>
-            <w:r>
-              <w:t xml:space="preserve">error</w:t>
-            </w:r>
-          </w:p>
-        </w:tc>
-      </w:tr>
-      <w:tr>
-        <w:tc>
-          <w:tcPr>
-            <w:tcW w:w="2160" w:type="dxa"/>
-          </w:tcPr>
-          <w:p>
-            <w:r>
-              <w:t xml:space="preserve">Error Response Message</w:t>
-            </w:r>
-          </w:p>
-        </w:tc>
-        <w:tc>
-          <w:tcPr>
-            <w:tcW w:w="7200" w:type="dxa"/>
-            <w:gridSpan w:val="2"/>
-          </w:tcPr>
-          <w:p>
-            <w:r>
-              <w:t xml:space="preserve">No pudimos cargar el celular. Intenta de nuevo más tarde.</w:t>
-            </w:r>
-          </w:p>
-        </w:tc>
-      </w:tr>
-      <w:tr>
-        <w:tc>
-          <w:tcPr>
-            <w:tcW w:w="2160" w:type="dxa"/>
-          </w:tcPr>
-          <w:p>
-            <w:r>
               <w:t xml:space="preserve">Empty List Title</w:t>
             </w:r>
           </w:p>
@@ -728,7 +636,7 @@
           </w:tcPr>
           <w:p>
             <w:r>
-              <w:t xml:space="preserve">Este celular no está disponible</w:t>
+              <w:t xml:space="preserve">Este celular no existe</w:t>
             </w:r>
           </w:p>
         </w:tc>
@@ -751,7 +659,7 @@
           </w:tcPr>
           <w:p>
             <w:r>
-              <w:t xml:space="preserve">Puede que ya no esté a la venta. Mira otros celulares.</w:t>
+              <w:t xml:space="preserve">Revisa el enlace o mira todos nuestros celulares.</w:t>
             </w:r>
           </w:p>
         </w:tc>

</xml_diff>